<commit_message>
Updated Observation Record with Task 6
</commit_message>
<xml_diff>
--- a/Observation_ javaRecord.docx
+++ b/Observation_ javaRecord.docx
@@ -20,7 +20,27 @@
           <w:sz w:val="28"/>
           <w:szCs w:val="28"/>
         </w:rPr>
-        <w:t>TASK 2: Access and Print the Element at a Given Index in an Array</w:t>
+        <w:t xml:space="preserve">TASK </w:t>
+      </w:r>
+      <w:r>
+        <w:rPr>
+          <w:rFonts w:ascii="Times New Roman" w:hAnsi="Times New Roman" w:cs="Times New Roman"/>
+          <w:b/>
+          <w:bCs/>
+          <w:sz w:val="28"/>
+          <w:szCs w:val="28"/>
+        </w:rPr>
+        <w:t>2</w:t>
+      </w:r>
+      <w:r>
+        <w:rPr>
+          <w:rFonts w:ascii="Times New Roman" w:hAnsi="Times New Roman" w:cs="Times New Roman"/>
+          <w:b/>
+          <w:bCs/>
+          <w:sz w:val="28"/>
+          <w:szCs w:val="28"/>
+        </w:rPr>
+        <w:t>: Access and Print the Element at a Given Index in an Array</w:t>
       </w:r>
     </w:p>
     <w:p>
@@ -540,7 +560,27 @@
           <w:szCs w:val="28"/>
         </w:rPr>
         <w:lastRenderedPageBreak/>
-        <w:t>TASK 3: Iterate Over an Array and Print All Elements</w:t>
+        <w:t xml:space="preserve">TASK </w:t>
+      </w:r>
+      <w:r>
+        <w:rPr>
+          <w:rFonts w:ascii="Times New Roman" w:hAnsi="Times New Roman" w:cs="Times New Roman"/>
+          <w:b/>
+          <w:bCs/>
+          <w:sz w:val="28"/>
+          <w:szCs w:val="28"/>
+        </w:rPr>
+        <w:t>3</w:t>
+      </w:r>
+      <w:r>
+        <w:rPr>
+          <w:rFonts w:ascii="Times New Roman" w:hAnsi="Times New Roman" w:cs="Times New Roman"/>
+          <w:b/>
+          <w:bCs/>
+          <w:sz w:val="28"/>
+          <w:szCs w:val="28"/>
+        </w:rPr>
+        <w:t>: Iterate Over an Array and Print All Elements</w:t>
       </w:r>
     </w:p>
     <w:p>
@@ -1097,7 +1137,27 @@
           <w:szCs w:val="28"/>
         </w:rPr>
         <w:lastRenderedPageBreak/>
-        <w:t xml:space="preserve">TASK 4: </w:t>
+        <w:t xml:space="preserve">TASK </w:t>
+      </w:r>
+      <w:r>
+        <w:rPr>
+          <w:rFonts w:ascii="Times New Roman" w:hAnsi="Times New Roman" w:cs="Times New Roman"/>
+          <w:b/>
+          <w:bCs/>
+          <w:sz w:val="28"/>
+          <w:szCs w:val="28"/>
+        </w:rPr>
+        <w:t>4</w:t>
+      </w:r>
+      <w:r>
+        <w:rPr>
+          <w:rFonts w:ascii="Times New Roman" w:hAnsi="Times New Roman" w:cs="Times New Roman"/>
+          <w:b/>
+          <w:bCs/>
+          <w:sz w:val="28"/>
+          <w:szCs w:val="28"/>
+        </w:rPr>
+        <w:t xml:space="preserve">: </w:t>
       </w:r>
       <w:r>
         <w:rPr>
@@ -4263,6 +4323,1629 @@
       </w:r>
     </w:p>
     <w:p/>
+    <w:p/>
+    <w:p/>
+    <w:p/>
+    <w:p/>
+    <w:p/>
+    <w:p/>
+    <w:p/>
+    <w:p/>
+    <w:p/>
+    <w:p/>
+    <w:p/>
+    <w:p/>
+    <w:p/>
+    <w:p/>
+    <w:p>
+      <w:pPr>
+        <w:rPr>
+          <w:rFonts w:ascii="Times New Roman" w:hAnsi="Times New Roman" w:cs="Times New Roman"/>
+          <w:b/>
+          <w:bCs/>
+          <w:sz w:val="28"/>
+          <w:szCs w:val="28"/>
+        </w:rPr>
+      </w:pPr>
+      <w:r>
+        <w:rPr>
+          <w:rFonts w:ascii="Times New Roman" w:hAnsi="Times New Roman" w:cs="Times New Roman"/>
+          <w:b/>
+          <w:bCs/>
+          <w:sz w:val="28"/>
+          <w:szCs w:val="28"/>
+        </w:rPr>
+        <w:lastRenderedPageBreak/>
+        <w:t>Task 6: Print all possible pairs of elements from an array of size n</w:t>
+      </w:r>
+    </w:p>
+    <w:p>
+      <w:pPr>
+        <w:rPr>
+          <w:rFonts w:ascii="Times New Roman" w:hAnsi="Times New Roman" w:cs="Times New Roman"/>
+          <w:b/>
+          <w:bCs/>
+          <w:sz w:val="28"/>
+          <w:szCs w:val="28"/>
+        </w:rPr>
+      </w:pPr>
+      <w:proofErr w:type="spellStart"/>
+      <w:proofErr w:type="gramStart"/>
+      <w:r>
+        <w:rPr>
+          <w:rFonts w:ascii="Times New Roman" w:hAnsi="Times New Roman" w:cs="Times New Roman"/>
+          <w:b/>
+          <w:bCs/>
+          <w:sz w:val="28"/>
+          <w:szCs w:val="28"/>
+        </w:rPr>
+        <w:t>Aim</w:t>
+      </w:r>
+      <w:r>
+        <w:rPr>
+          <w:rFonts w:ascii="Times New Roman" w:hAnsi="Times New Roman" w:cs="Times New Roman"/>
+          <w:b/>
+          <w:bCs/>
+          <w:sz w:val="28"/>
+          <w:szCs w:val="28"/>
+        </w:rPr>
+        <w:t>:</w:t>
+      </w:r>
+      <w:r>
+        <w:rPr>
+          <w:rFonts w:ascii="Times New Roman" w:hAnsi="Times New Roman" w:cs="Times New Roman"/>
+          <w:sz w:val="28"/>
+          <w:szCs w:val="28"/>
+        </w:rPr>
+        <w:t>To</w:t>
+      </w:r>
+      <w:proofErr w:type="spellEnd"/>
+      <w:proofErr w:type="gramEnd"/>
+      <w:r>
+        <w:rPr>
+          <w:rFonts w:ascii="Times New Roman" w:hAnsi="Times New Roman" w:cs="Times New Roman"/>
+          <w:sz w:val="28"/>
+          <w:szCs w:val="28"/>
+        </w:rPr>
+        <w:t xml:space="preserve"> write a Java program to print all possible pairs of elements from an array.</w:t>
+      </w:r>
+    </w:p>
+    <w:p>
+      <w:pPr>
+        <w:rPr>
+          <w:rFonts w:ascii="Times New Roman" w:hAnsi="Times New Roman" w:cs="Times New Roman"/>
+          <w:sz w:val="28"/>
+          <w:szCs w:val="28"/>
+        </w:rPr>
+      </w:pPr>
+    </w:p>
+    <w:p>
+      <w:pPr>
+        <w:rPr>
+          <w:rFonts w:ascii="Times New Roman" w:hAnsi="Times New Roman" w:cs="Times New Roman"/>
+          <w:b/>
+          <w:bCs/>
+          <w:sz w:val="28"/>
+          <w:szCs w:val="28"/>
+        </w:rPr>
+      </w:pPr>
+      <w:r>
+        <w:rPr>
+          <w:rFonts w:ascii="Times New Roman" w:hAnsi="Times New Roman" w:cs="Times New Roman"/>
+          <w:b/>
+          <w:bCs/>
+          <w:sz w:val="28"/>
+          <w:szCs w:val="28"/>
+        </w:rPr>
+        <w:t>Algorithm</w:t>
+      </w:r>
+      <w:r>
+        <w:rPr>
+          <w:rFonts w:ascii="Times New Roman" w:hAnsi="Times New Roman" w:cs="Times New Roman"/>
+          <w:b/>
+          <w:bCs/>
+          <w:sz w:val="28"/>
+          <w:szCs w:val="28"/>
+        </w:rPr>
+        <w:t>:</w:t>
+      </w:r>
+    </w:p>
+    <w:p>
+      <w:pPr>
+        <w:numPr>
+          <w:ilvl w:val="0"/>
+          <w:numId w:val="7"/>
+        </w:numPr>
+        <w:rPr>
+          <w:rFonts w:ascii="Times New Roman" w:hAnsi="Times New Roman" w:cs="Times New Roman"/>
+          <w:sz w:val="28"/>
+          <w:szCs w:val="28"/>
+        </w:rPr>
+      </w:pPr>
+      <w:r>
+        <w:rPr>
+          <w:rFonts w:ascii="Times New Roman" w:hAnsi="Times New Roman" w:cs="Times New Roman"/>
+          <w:sz w:val="28"/>
+          <w:szCs w:val="28"/>
+        </w:rPr>
+        <w:t xml:space="preserve">Start the program. </w:t>
+      </w:r>
+    </w:p>
+    <w:p>
+      <w:pPr>
+        <w:numPr>
+          <w:ilvl w:val="0"/>
+          <w:numId w:val="7"/>
+        </w:numPr>
+        <w:rPr>
+          <w:rFonts w:ascii="Times New Roman" w:hAnsi="Times New Roman" w:cs="Times New Roman"/>
+          <w:sz w:val="28"/>
+          <w:szCs w:val="28"/>
+        </w:rPr>
+      </w:pPr>
+      <w:r>
+        <w:rPr>
+          <w:rFonts w:ascii="Times New Roman" w:hAnsi="Times New Roman" w:cs="Times New Roman"/>
+          <w:sz w:val="28"/>
+          <w:szCs w:val="28"/>
+        </w:rPr>
+        <w:t xml:space="preserve">Read the number of elements (n) from the user. </w:t>
+      </w:r>
+    </w:p>
+    <w:p>
+      <w:pPr>
+        <w:numPr>
+          <w:ilvl w:val="0"/>
+          <w:numId w:val="7"/>
+        </w:numPr>
+        <w:rPr>
+          <w:rFonts w:ascii="Times New Roman" w:hAnsi="Times New Roman" w:cs="Times New Roman"/>
+          <w:sz w:val="28"/>
+          <w:szCs w:val="28"/>
+        </w:rPr>
+      </w:pPr>
+      <w:r>
+        <w:rPr>
+          <w:rFonts w:ascii="Times New Roman" w:hAnsi="Times New Roman" w:cs="Times New Roman"/>
+          <w:sz w:val="28"/>
+          <w:szCs w:val="28"/>
+        </w:rPr>
+        <w:t xml:space="preserve">Read the array elements. </w:t>
+      </w:r>
+    </w:p>
+    <w:p>
+      <w:pPr>
+        <w:numPr>
+          <w:ilvl w:val="0"/>
+          <w:numId w:val="7"/>
+        </w:numPr>
+        <w:rPr>
+          <w:rFonts w:ascii="Times New Roman" w:hAnsi="Times New Roman" w:cs="Times New Roman"/>
+          <w:sz w:val="28"/>
+          <w:szCs w:val="28"/>
+        </w:rPr>
+      </w:pPr>
+      <w:r>
+        <w:rPr>
+          <w:rFonts w:ascii="Times New Roman" w:hAnsi="Times New Roman" w:cs="Times New Roman"/>
+          <w:sz w:val="28"/>
+          <w:szCs w:val="28"/>
+        </w:rPr>
+        <w:t xml:space="preserve">Use two nested loops: </w:t>
+      </w:r>
+    </w:p>
+    <w:p>
+      <w:pPr>
+        <w:numPr>
+          <w:ilvl w:val="1"/>
+          <w:numId w:val="7"/>
+        </w:numPr>
+        <w:rPr>
+          <w:rFonts w:ascii="Times New Roman" w:hAnsi="Times New Roman" w:cs="Times New Roman"/>
+          <w:sz w:val="28"/>
+          <w:szCs w:val="28"/>
+        </w:rPr>
+      </w:pPr>
+      <w:r>
+        <w:rPr>
+          <w:rFonts w:ascii="Times New Roman" w:hAnsi="Times New Roman" w:cs="Times New Roman"/>
+          <w:sz w:val="28"/>
+          <w:szCs w:val="28"/>
+        </w:rPr>
+        <w:t xml:space="preserve">The outer loop selects the first element. </w:t>
+      </w:r>
+    </w:p>
+    <w:p>
+      <w:pPr>
+        <w:numPr>
+          <w:ilvl w:val="1"/>
+          <w:numId w:val="7"/>
+        </w:numPr>
+        <w:rPr>
+          <w:rFonts w:ascii="Times New Roman" w:hAnsi="Times New Roman" w:cs="Times New Roman"/>
+          <w:sz w:val="28"/>
+          <w:szCs w:val="28"/>
+        </w:rPr>
+      </w:pPr>
+      <w:r>
+        <w:rPr>
+          <w:rFonts w:ascii="Times New Roman" w:hAnsi="Times New Roman" w:cs="Times New Roman"/>
+          <w:sz w:val="28"/>
+          <w:szCs w:val="28"/>
+        </w:rPr>
+        <w:t xml:space="preserve">The inner loop selects the remaining elements after the first. </w:t>
+      </w:r>
+    </w:p>
+    <w:p>
+      <w:pPr>
+        <w:numPr>
+          <w:ilvl w:val="0"/>
+          <w:numId w:val="7"/>
+        </w:numPr>
+        <w:rPr>
+          <w:rFonts w:ascii="Times New Roman" w:hAnsi="Times New Roman" w:cs="Times New Roman"/>
+          <w:sz w:val="28"/>
+          <w:szCs w:val="28"/>
+        </w:rPr>
+      </w:pPr>
+      <w:r>
+        <w:rPr>
+          <w:rFonts w:ascii="Times New Roman" w:hAnsi="Times New Roman" w:cs="Times New Roman"/>
+          <w:sz w:val="28"/>
+          <w:szCs w:val="28"/>
+        </w:rPr>
+        <w:t xml:space="preserve">Print each pair in the format (element1, element2). </w:t>
+      </w:r>
+    </w:p>
+    <w:p>
+      <w:pPr>
+        <w:numPr>
+          <w:ilvl w:val="0"/>
+          <w:numId w:val="7"/>
+        </w:numPr>
+        <w:rPr>
+          <w:rFonts w:ascii="Times New Roman" w:hAnsi="Times New Roman" w:cs="Times New Roman"/>
+          <w:sz w:val="28"/>
+          <w:szCs w:val="28"/>
+        </w:rPr>
+      </w:pPr>
+      <w:r>
+        <w:rPr>
+          <w:rFonts w:ascii="Times New Roman" w:hAnsi="Times New Roman" w:cs="Times New Roman"/>
+          <w:sz w:val="28"/>
+          <w:szCs w:val="28"/>
+        </w:rPr>
+        <w:t xml:space="preserve">Stop the program. </w:t>
+      </w:r>
+    </w:p>
+    <w:p>
+      <w:pPr>
+        <w:rPr>
+          <w:rFonts w:ascii="Times New Roman" w:hAnsi="Times New Roman" w:cs="Times New Roman"/>
+          <w:sz w:val="28"/>
+          <w:szCs w:val="28"/>
+        </w:rPr>
+      </w:pPr>
+    </w:p>
+    <w:p>
+      <w:pPr>
+        <w:rPr>
+          <w:rFonts w:ascii="Times New Roman" w:hAnsi="Times New Roman" w:cs="Times New Roman"/>
+          <w:b/>
+          <w:bCs/>
+          <w:sz w:val="28"/>
+          <w:szCs w:val="28"/>
+        </w:rPr>
+      </w:pPr>
+      <w:r>
+        <w:rPr>
+          <w:rFonts w:ascii="Times New Roman" w:hAnsi="Times New Roman" w:cs="Times New Roman"/>
+          <w:b/>
+          <w:bCs/>
+          <w:sz w:val="28"/>
+          <w:szCs w:val="28"/>
+        </w:rPr>
+        <w:t>Program</w:t>
+      </w:r>
+      <w:r>
+        <w:rPr>
+          <w:rFonts w:ascii="Times New Roman" w:hAnsi="Times New Roman" w:cs="Times New Roman"/>
+          <w:b/>
+          <w:bCs/>
+          <w:sz w:val="28"/>
+          <w:szCs w:val="28"/>
+        </w:rPr>
+        <w:t>:</w:t>
+      </w:r>
+    </w:p>
+    <w:p>
+      <w:pPr>
+        <w:rPr>
+          <w:rFonts w:ascii="Times New Roman" w:hAnsi="Times New Roman" w:cs="Times New Roman"/>
+          <w:sz w:val="28"/>
+          <w:szCs w:val="28"/>
+        </w:rPr>
+      </w:pPr>
+      <w:r>
+        <w:rPr>
+          <w:rFonts w:ascii="Times New Roman" w:hAnsi="Times New Roman" w:cs="Times New Roman"/>
+          <w:sz w:val="28"/>
+          <w:szCs w:val="28"/>
+        </w:rPr>
+        <w:t xml:space="preserve">import </w:t>
+      </w:r>
+      <w:proofErr w:type="spellStart"/>
+      <w:proofErr w:type="gramStart"/>
+      <w:r>
+        <w:rPr>
+          <w:rFonts w:ascii="Times New Roman" w:hAnsi="Times New Roman" w:cs="Times New Roman"/>
+          <w:sz w:val="28"/>
+          <w:szCs w:val="28"/>
+        </w:rPr>
+        <w:t>java.util</w:t>
+      </w:r>
+      <w:proofErr w:type="gramEnd"/>
+      <w:r>
+        <w:rPr>
+          <w:rFonts w:ascii="Times New Roman" w:hAnsi="Times New Roman" w:cs="Times New Roman"/>
+          <w:sz w:val="28"/>
+          <w:szCs w:val="28"/>
+        </w:rPr>
+        <w:t>.Scanner</w:t>
+      </w:r>
+      <w:proofErr w:type="spellEnd"/>
+      <w:r>
+        <w:rPr>
+          <w:rFonts w:ascii="Times New Roman" w:hAnsi="Times New Roman" w:cs="Times New Roman"/>
+          <w:sz w:val="28"/>
+          <w:szCs w:val="28"/>
+        </w:rPr>
+        <w:t>;</w:t>
+      </w:r>
+    </w:p>
+    <w:p>
+      <w:pPr>
+        <w:rPr>
+          <w:rFonts w:ascii="Times New Roman" w:hAnsi="Times New Roman" w:cs="Times New Roman"/>
+          <w:sz w:val="28"/>
+          <w:szCs w:val="28"/>
+        </w:rPr>
+      </w:pPr>
+    </w:p>
+    <w:p>
+      <w:pPr>
+        <w:rPr>
+          <w:rFonts w:ascii="Times New Roman" w:hAnsi="Times New Roman" w:cs="Times New Roman"/>
+          <w:sz w:val="28"/>
+          <w:szCs w:val="28"/>
+        </w:rPr>
+      </w:pPr>
+      <w:r>
+        <w:rPr>
+          <w:rFonts w:ascii="Times New Roman" w:hAnsi="Times New Roman" w:cs="Times New Roman"/>
+          <w:sz w:val="28"/>
+          <w:szCs w:val="28"/>
+        </w:rPr>
+        <w:t>public class Task6 {</w:t>
+      </w:r>
+    </w:p>
+    <w:p>
+      <w:pPr>
+        <w:rPr>
+          <w:rFonts w:ascii="Times New Roman" w:hAnsi="Times New Roman" w:cs="Times New Roman"/>
+          <w:sz w:val="28"/>
+          <w:szCs w:val="28"/>
+        </w:rPr>
+      </w:pPr>
+      <w:r>
+        <w:rPr>
+          <w:rFonts w:ascii="Times New Roman" w:hAnsi="Times New Roman" w:cs="Times New Roman"/>
+          <w:sz w:val="28"/>
+          <w:szCs w:val="28"/>
+        </w:rPr>
+        <w:t xml:space="preserve">    public static void </w:t>
+      </w:r>
+      <w:proofErr w:type="gramStart"/>
+      <w:r>
+        <w:rPr>
+          <w:rFonts w:ascii="Times New Roman" w:hAnsi="Times New Roman" w:cs="Times New Roman"/>
+          <w:sz w:val="28"/>
+          <w:szCs w:val="28"/>
+        </w:rPr>
+        <w:t>main(String[</w:t>
+      </w:r>
+      <w:proofErr w:type="gramEnd"/>
+      <w:r>
+        <w:rPr>
+          <w:rFonts w:ascii="Times New Roman" w:hAnsi="Times New Roman" w:cs="Times New Roman"/>
+          <w:sz w:val="28"/>
+          <w:szCs w:val="28"/>
+        </w:rPr>
+        <w:t xml:space="preserve">] </w:t>
+      </w:r>
+      <w:proofErr w:type="spellStart"/>
+      <w:r>
+        <w:rPr>
+          <w:rFonts w:ascii="Times New Roman" w:hAnsi="Times New Roman" w:cs="Times New Roman"/>
+          <w:sz w:val="28"/>
+          <w:szCs w:val="28"/>
+        </w:rPr>
+        <w:t>args</w:t>
+      </w:r>
+      <w:proofErr w:type="spellEnd"/>
+      <w:r>
+        <w:rPr>
+          <w:rFonts w:ascii="Times New Roman" w:hAnsi="Times New Roman" w:cs="Times New Roman"/>
+          <w:sz w:val="28"/>
+          <w:szCs w:val="28"/>
+        </w:rPr>
+        <w:t>) {</w:t>
+      </w:r>
+    </w:p>
+    <w:p>
+      <w:pPr>
+        <w:rPr>
+          <w:rFonts w:ascii="Times New Roman" w:hAnsi="Times New Roman" w:cs="Times New Roman"/>
+          <w:sz w:val="28"/>
+          <w:szCs w:val="28"/>
+        </w:rPr>
+      </w:pPr>
+      <w:r>
+        <w:rPr>
+          <w:rFonts w:ascii="Times New Roman" w:hAnsi="Times New Roman" w:cs="Times New Roman"/>
+          <w:sz w:val="28"/>
+          <w:szCs w:val="28"/>
+        </w:rPr>
+        <w:t xml:space="preserve">        Scanner </w:t>
+      </w:r>
+      <w:proofErr w:type="spellStart"/>
+      <w:r>
+        <w:rPr>
+          <w:rFonts w:ascii="Times New Roman" w:hAnsi="Times New Roman" w:cs="Times New Roman"/>
+          <w:sz w:val="28"/>
+          <w:szCs w:val="28"/>
+        </w:rPr>
+        <w:t>sc</w:t>
+      </w:r>
+      <w:proofErr w:type="spellEnd"/>
+      <w:r>
+        <w:rPr>
+          <w:rFonts w:ascii="Times New Roman" w:hAnsi="Times New Roman" w:cs="Times New Roman"/>
+          <w:sz w:val="28"/>
+          <w:szCs w:val="28"/>
+        </w:rPr>
+        <w:t xml:space="preserve"> = new </w:t>
+      </w:r>
+      <w:proofErr w:type="gramStart"/>
+      <w:r>
+        <w:rPr>
+          <w:rFonts w:ascii="Times New Roman" w:hAnsi="Times New Roman" w:cs="Times New Roman"/>
+          <w:sz w:val="28"/>
+          <w:szCs w:val="28"/>
+        </w:rPr>
+        <w:t>Scanner(</w:t>
+      </w:r>
+      <w:proofErr w:type="gramEnd"/>
+      <w:r>
+        <w:rPr>
+          <w:rFonts w:ascii="Times New Roman" w:hAnsi="Times New Roman" w:cs="Times New Roman"/>
+          <w:sz w:val="28"/>
+          <w:szCs w:val="28"/>
+        </w:rPr>
+        <w:t>System.in);</w:t>
+      </w:r>
+    </w:p>
+    <w:p>
+      <w:pPr>
+        <w:rPr>
+          <w:rFonts w:ascii="Times New Roman" w:hAnsi="Times New Roman" w:cs="Times New Roman"/>
+          <w:sz w:val="28"/>
+          <w:szCs w:val="28"/>
+        </w:rPr>
+      </w:pPr>
+    </w:p>
+    <w:p>
+      <w:pPr>
+        <w:rPr>
+          <w:rFonts w:ascii="Times New Roman" w:hAnsi="Times New Roman" w:cs="Times New Roman"/>
+          <w:sz w:val="28"/>
+          <w:szCs w:val="28"/>
+        </w:rPr>
+      </w:pPr>
+      <w:r>
+        <w:rPr>
+          <w:rFonts w:ascii="Times New Roman" w:hAnsi="Times New Roman" w:cs="Times New Roman"/>
+          <w:sz w:val="28"/>
+          <w:szCs w:val="28"/>
+        </w:rPr>
+        <w:t xml:space="preserve">        </w:t>
+      </w:r>
+      <w:proofErr w:type="spellStart"/>
+      <w:r>
+        <w:rPr>
+          <w:rFonts w:ascii="Times New Roman" w:hAnsi="Times New Roman" w:cs="Times New Roman"/>
+          <w:sz w:val="28"/>
+          <w:szCs w:val="28"/>
+        </w:rPr>
+        <w:t>System.out.print</w:t>
+      </w:r>
+      <w:proofErr w:type="spellEnd"/>
+      <w:r>
+        <w:rPr>
+          <w:rFonts w:ascii="Times New Roman" w:hAnsi="Times New Roman" w:cs="Times New Roman"/>
+          <w:sz w:val="28"/>
+          <w:szCs w:val="28"/>
+        </w:rPr>
+        <w:t>("Enter the number of elements: ");</w:t>
+      </w:r>
+    </w:p>
+    <w:p>
+      <w:pPr>
+        <w:rPr>
+          <w:rFonts w:ascii="Times New Roman" w:hAnsi="Times New Roman" w:cs="Times New Roman"/>
+          <w:sz w:val="28"/>
+          <w:szCs w:val="28"/>
+        </w:rPr>
+      </w:pPr>
+      <w:r>
+        <w:rPr>
+          <w:rFonts w:ascii="Times New Roman" w:hAnsi="Times New Roman" w:cs="Times New Roman"/>
+          <w:sz w:val="28"/>
+          <w:szCs w:val="28"/>
+        </w:rPr>
+        <w:t xml:space="preserve">        int n = </w:t>
+      </w:r>
+      <w:proofErr w:type="spellStart"/>
+      <w:proofErr w:type="gramStart"/>
+      <w:r>
+        <w:rPr>
+          <w:rFonts w:ascii="Times New Roman" w:hAnsi="Times New Roman" w:cs="Times New Roman"/>
+          <w:sz w:val="28"/>
+          <w:szCs w:val="28"/>
+        </w:rPr>
+        <w:t>sc.nextInt</w:t>
+      </w:r>
+      <w:proofErr w:type="spellEnd"/>
+      <w:proofErr w:type="gramEnd"/>
+      <w:r>
+        <w:rPr>
+          <w:rFonts w:ascii="Times New Roman" w:hAnsi="Times New Roman" w:cs="Times New Roman"/>
+          <w:sz w:val="28"/>
+          <w:szCs w:val="28"/>
+        </w:rPr>
+        <w:t>();</w:t>
+      </w:r>
+    </w:p>
+    <w:p>
+      <w:pPr>
+        <w:rPr>
+          <w:rFonts w:ascii="Times New Roman" w:hAnsi="Times New Roman" w:cs="Times New Roman"/>
+          <w:sz w:val="28"/>
+          <w:szCs w:val="28"/>
+        </w:rPr>
+      </w:pPr>
+    </w:p>
+    <w:p>
+      <w:pPr>
+        <w:rPr>
+          <w:rFonts w:ascii="Times New Roman" w:hAnsi="Times New Roman" w:cs="Times New Roman"/>
+          <w:sz w:val="28"/>
+          <w:szCs w:val="28"/>
+        </w:rPr>
+      </w:pPr>
+      <w:r>
+        <w:rPr>
+          <w:rFonts w:ascii="Times New Roman" w:hAnsi="Times New Roman" w:cs="Times New Roman"/>
+          <w:sz w:val="28"/>
+          <w:szCs w:val="28"/>
+        </w:rPr>
+        <w:t xml:space="preserve">        </w:t>
+      </w:r>
+      <w:proofErr w:type="gramStart"/>
+      <w:r>
+        <w:rPr>
+          <w:rFonts w:ascii="Times New Roman" w:hAnsi="Times New Roman" w:cs="Times New Roman"/>
+          <w:sz w:val="28"/>
+          <w:szCs w:val="28"/>
+        </w:rPr>
+        <w:t>int[</w:t>
+      </w:r>
+      <w:proofErr w:type="gramEnd"/>
+      <w:r>
+        <w:rPr>
+          <w:rFonts w:ascii="Times New Roman" w:hAnsi="Times New Roman" w:cs="Times New Roman"/>
+          <w:sz w:val="28"/>
+          <w:szCs w:val="28"/>
+        </w:rPr>
+        <w:t xml:space="preserve">] </w:t>
+      </w:r>
+      <w:proofErr w:type="spellStart"/>
+      <w:r>
+        <w:rPr>
+          <w:rFonts w:ascii="Times New Roman" w:hAnsi="Times New Roman" w:cs="Times New Roman"/>
+          <w:sz w:val="28"/>
+          <w:szCs w:val="28"/>
+        </w:rPr>
+        <w:t>arr</w:t>
+      </w:r>
+      <w:proofErr w:type="spellEnd"/>
+      <w:r>
+        <w:rPr>
+          <w:rFonts w:ascii="Times New Roman" w:hAnsi="Times New Roman" w:cs="Times New Roman"/>
+          <w:sz w:val="28"/>
+          <w:szCs w:val="28"/>
+        </w:rPr>
+        <w:t xml:space="preserve"> = new int[n];</w:t>
+      </w:r>
+    </w:p>
+    <w:p>
+      <w:pPr>
+        <w:rPr>
+          <w:rFonts w:ascii="Times New Roman" w:hAnsi="Times New Roman" w:cs="Times New Roman"/>
+          <w:sz w:val="28"/>
+          <w:szCs w:val="28"/>
+        </w:rPr>
+      </w:pPr>
+    </w:p>
+    <w:p>
+      <w:pPr>
+        <w:rPr>
+          <w:rFonts w:ascii="Times New Roman" w:hAnsi="Times New Roman" w:cs="Times New Roman"/>
+          <w:sz w:val="28"/>
+          <w:szCs w:val="28"/>
+        </w:rPr>
+      </w:pPr>
+      <w:r>
+        <w:rPr>
+          <w:rFonts w:ascii="Times New Roman" w:hAnsi="Times New Roman" w:cs="Times New Roman"/>
+          <w:sz w:val="28"/>
+          <w:szCs w:val="28"/>
+        </w:rPr>
+        <w:lastRenderedPageBreak/>
+        <w:t xml:space="preserve">        </w:t>
+      </w:r>
+      <w:proofErr w:type="spellStart"/>
+      <w:r>
+        <w:rPr>
+          <w:rFonts w:ascii="Times New Roman" w:hAnsi="Times New Roman" w:cs="Times New Roman"/>
+          <w:sz w:val="28"/>
+          <w:szCs w:val="28"/>
+        </w:rPr>
+        <w:t>System.out.println</w:t>
+      </w:r>
+      <w:proofErr w:type="spellEnd"/>
+      <w:r>
+        <w:rPr>
+          <w:rFonts w:ascii="Times New Roman" w:hAnsi="Times New Roman" w:cs="Times New Roman"/>
+          <w:sz w:val="28"/>
+          <w:szCs w:val="28"/>
+        </w:rPr>
+        <w:t>("Enter the array elements:");</w:t>
+      </w:r>
+    </w:p>
+    <w:p>
+      <w:pPr>
+        <w:rPr>
+          <w:rFonts w:ascii="Times New Roman" w:hAnsi="Times New Roman" w:cs="Times New Roman"/>
+          <w:sz w:val="28"/>
+          <w:szCs w:val="28"/>
+        </w:rPr>
+      </w:pPr>
+      <w:r>
+        <w:rPr>
+          <w:rFonts w:ascii="Times New Roman" w:hAnsi="Times New Roman" w:cs="Times New Roman"/>
+          <w:sz w:val="28"/>
+          <w:szCs w:val="28"/>
+        </w:rPr>
+        <w:t xml:space="preserve">        for (int </w:t>
+      </w:r>
+      <w:proofErr w:type="spellStart"/>
+      <w:r>
+        <w:rPr>
+          <w:rFonts w:ascii="Times New Roman" w:hAnsi="Times New Roman" w:cs="Times New Roman"/>
+          <w:sz w:val="28"/>
+          <w:szCs w:val="28"/>
+        </w:rPr>
+        <w:t>i</w:t>
+      </w:r>
+      <w:proofErr w:type="spellEnd"/>
+      <w:r>
+        <w:rPr>
+          <w:rFonts w:ascii="Times New Roman" w:hAnsi="Times New Roman" w:cs="Times New Roman"/>
+          <w:sz w:val="28"/>
+          <w:szCs w:val="28"/>
+        </w:rPr>
+        <w:t xml:space="preserve"> = 0; </w:t>
+      </w:r>
+      <w:proofErr w:type="spellStart"/>
+      <w:r>
+        <w:rPr>
+          <w:rFonts w:ascii="Times New Roman" w:hAnsi="Times New Roman" w:cs="Times New Roman"/>
+          <w:sz w:val="28"/>
+          <w:szCs w:val="28"/>
+        </w:rPr>
+        <w:t>i</w:t>
+      </w:r>
+      <w:proofErr w:type="spellEnd"/>
+      <w:r>
+        <w:rPr>
+          <w:rFonts w:ascii="Times New Roman" w:hAnsi="Times New Roman" w:cs="Times New Roman"/>
+          <w:sz w:val="28"/>
+          <w:szCs w:val="28"/>
+        </w:rPr>
+        <w:t xml:space="preserve"> &lt; n; </w:t>
+      </w:r>
+      <w:proofErr w:type="spellStart"/>
+      <w:r>
+        <w:rPr>
+          <w:rFonts w:ascii="Times New Roman" w:hAnsi="Times New Roman" w:cs="Times New Roman"/>
+          <w:sz w:val="28"/>
+          <w:szCs w:val="28"/>
+        </w:rPr>
+        <w:t>i</w:t>
+      </w:r>
+      <w:proofErr w:type="spellEnd"/>
+      <w:r>
+        <w:rPr>
+          <w:rFonts w:ascii="Times New Roman" w:hAnsi="Times New Roman" w:cs="Times New Roman"/>
+          <w:sz w:val="28"/>
+          <w:szCs w:val="28"/>
+        </w:rPr>
+        <w:t>++) {</w:t>
+      </w:r>
+    </w:p>
+    <w:p>
+      <w:pPr>
+        <w:rPr>
+          <w:rFonts w:ascii="Times New Roman" w:hAnsi="Times New Roman" w:cs="Times New Roman"/>
+          <w:sz w:val="28"/>
+          <w:szCs w:val="28"/>
+        </w:rPr>
+      </w:pPr>
+      <w:r>
+        <w:rPr>
+          <w:rFonts w:ascii="Times New Roman" w:hAnsi="Times New Roman" w:cs="Times New Roman"/>
+          <w:sz w:val="28"/>
+          <w:szCs w:val="28"/>
+        </w:rPr>
+        <w:t xml:space="preserve">            </w:t>
+      </w:r>
+      <w:proofErr w:type="spellStart"/>
+      <w:r>
+        <w:rPr>
+          <w:rFonts w:ascii="Times New Roman" w:hAnsi="Times New Roman" w:cs="Times New Roman"/>
+          <w:sz w:val="28"/>
+          <w:szCs w:val="28"/>
+        </w:rPr>
+        <w:t>arr</w:t>
+      </w:r>
+      <w:proofErr w:type="spellEnd"/>
+      <w:r>
+        <w:rPr>
+          <w:rFonts w:ascii="Times New Roman" w:hAnsi="Times New Roman" w:cs="Times New Roman"/>
+          <w:sz w:val="28"/>
+          <w:szCs w:val="28"/>
+        </w:rPr>
+        <w:t>[</w:t>
+      </w:r>
+      <w:proofErr w:type="spellStart"/>
+      <w:r>
+        <w:rPr>
+          <w:rFonts w:ascii="Times New Roman" w:hAnsi="Times New Roman" w:cs="Times New Roman"/>
+          <w:sz w:val="28"/>
+          <w:szCs w:val="28"/>
+        </w:rPr>
+        <w:t>i</w:t>
+      </w:r>
+      <w:proofErr w:type="spellEnd"/>
+      <w:r>
+        <w:rPr>
+          <w:rFonts w:ascii="Times New Roman" w:hAnsi="Times New Roman" w:cs="Times New Roman"/>
+          <w:sz w:val="28"/>
+          <w:szCs w:val="28"/>
+        </w:rPr>
+        <w:t xml:space="preserve">] = </w:t>
+      </w:r>
+      <w:proofErr w:type="spellStart"/>
+      <w:proofErr w:type="gramStart"/>
+      <w:r>
+        <w:rPr>
+          <w:rFonts w:ascii="Times New Roman" w:hAnsi="Times New Roman" w:cs="Times New Roman"/>
+          <w:sz w:val="28"/>
+          <w:szCs w:val="28"/>
+        </w:rPr>
+        <w:t>sc.nextInt</w:t>
+      </w:r>
+      <w:proofErr w:type="spellEnd"/>
+      <w:proofErr w:type="gramEnd"/>
+      <w:r>
+        <w:rPr>
+          <w:rFonts w:ascii="Times New Roman" w:hAnsi="Times New Roman" w:cs="Times New Roman"/>
+          <w:sz w:val="28"/>
+          <w:szCs w:val="28"/>
+        </w:rPr>
+        <w:t>();</w:t>
+      </w:r>
+    </w:p>
+    <w:p>
+      <w:pPr>
+        <w:rPr>
+          <w:rFonts w:ascii="Times New Roman" w:hAnsi="Times New Roman" w:cs="Times New Roman"/>
+          <w:sz w:val="28"/>
+          <w:szCs w:val="28"/>
+        </w:rPr>
+      </w:pPr>
+      <w:r>
+        <w:rPr>
+          <w:rFonts w:ascii="Times New Roman" w:hAnsi="Times New Roman" w:cs="Times New Roman"/>
+          <w:sz w:val="28"/>
+          <w:szCs w:val="28"/>
+        </w:rPr>
+        <w:t xml:space="preserve">        }</w:t>
+      </w:r>
+    </w:p>
+    <w:p>
+      <w:pPr>
+        <w:rPr>
+          <w:rFonts w:ascii="Times New Roman" w:hAnsi="Times New Roman" w:cs="Times New Roman"/>
+          <w:sz w:val="28"/>
+          <w:szCs w:val="28"/>
+        </w:rPr>
+      </w:pPr>
+    </w:p>
+    <w:p>
+      <w:pPr>
+        <w:rPr>
+          <w:rFonts w:ascii="Times New Roman" w:hAnsi="Times New Roman" w:cs="Times New Roman"/>
+          <w:sz w:val="28"/>
+          <w:szCs w:val="28"/>
+        </w:rPr>
+      </w:pPr>
+      <w:r>
+        <w:rPr>
+          <w:rFonts w:ascii="Times New Roman" w:hAnsi="Times New Roman" w:cs="Times New Roman"/>
+          <w:sz w:val="28"/>
+          <w:szCs w:val="28"/>
+        </w:rPr>
+        <w:t xml:space="preserve">        </w:t>
+      </w:r>
+      <w:proofErr w:type="spellStart"/>
+      <w:r>
+        <w:rPr>
+          <w:rFonts w:ascii="Times New Roman" w:hAnsi="Times New Roman" w:cs="Times New Roman"/>
+          <w:sz w:val="28"/>
+          <w:szCs w:val="28"/>
+        </w:rPr>
+        <w:t>System.out.println</w:t>
+      </w:r>
+      <w:proofErr w:type="spellEnd"/>
+      <w:r>
+        <w:rPr>
+          <w:rFonts w:ascii="Times New Roman" w:hAnsi="Times New Roman" w:cs="Times New Roman"/>
+          <w:sz w:val="28"/>
+          <w:szCs w:val="28"/>
+        </w:rPr>
+        <w:t>("All possible pairs are:");</w:t>
+      </w:r>
+    </w:p>
+    <w:p>
+      <w:pPr>
+        <w:rPr>
+          <w:rFonts w:ascii="Times New Roman" w:hAnsi="Times New Roman" w:cs="Times New Roman"/>
+          <w:sz w:val="28"/>
+          <w:szCs w:val="28"/>
+        </w:rPr>
+      </w:pPr>
+    </w:p>
+    <w:p>
+      <w:pPr>
+        <w:rPr>
+          <w:rFonts w:ascii="Times New Roman" w:hAnsi="Times New Roman" w:cs="Times New Roman"/>
+          <w:sz w:val="28"/>
+          <w:szCs w:val="28"/>
+        </w:rPr>
+      </w:pPr>
+      <w:r>
+        <w:rPr>
+          <w:rFonts w:ascii="Times New Roman" w:hAnsi="Times New Roman" w:cs="Times New Roman"/>
+          <w:sz w:val="28"/>
+          <w:szCs w:val="28"/>
+        </w:rPr>
+        <w:t xml:space="preserve">        for (int </w:t>
+      </w:r>
+      <w:proofErr w:type="spellStart"/>
+      <w:r>
+        <w:rPr>
+          <w:rFonts w:ascii="Times New Roman" w:hAnsi="Times New Roman" w:cs="Times New Roman"/>
+          <w:sz w:val="28"/>
+          <w:szCs w:val="28"/>
+        </w:rPr>
+        <w:t>i</w:t>
+      </w:r>
+      <w:proofErr w:type="spellEnd"/>
+      <w:r>
+        <w:rPr>
+          <w:rFonts w:ascii="Times New Roman" w:hAnsi="Times New Roman" w:cs="Times New Roman"/>
+          <w:sz w:val="28"/>
+          <w:szCs w:val="28"/>
+        </w:rPr>
+        <w:t xml:space="preserve"> = 0; </w:t>
+      </w:r>
+      <w:proofErr w:type="spellStart"/>
+      <w:r>
+        <w:rPr>
+          <w:rFonts w:ascii="Times New Roman" w:hAnsi="Times New Roman" w:cs="Times New Roman"/>
+          <w:sz w:val="28"/>
+          <w:szCs w:val="28"/>
+        </w:rPr>
+        <w:t>i</w:t>
+      </w:r>
+      <w:proofErr w:type="spellEnd"/>
+      <w:r>
+        <w:rPr>
+          <w:rFonts w:ascii="Times New Roman" w:hAnsi="Times New Roman" w:cs="Times New Roman"/>
+          <w:sz w:val="28"/>
+          <w:szCs w:val="28"/>
+        </w:rPr>
+        <w:t xml:space="preserve"> &lt; n - 1; </w:t>
+      </w:r>
+      <w:proofErr w:type="spellStart"/>
+      <w:r>
+        <w:rPr>
+          <w:rFonts w:ascii="Times New Roman" w:hAnsi="Times New Roman" w:cs="Times New Roman"/>
+          <w:sz w:val="28"/>
+          <w:szCs w:val="28"/>
+        </w:rPr>
+        <w:t>i</w:t>
+      </w:r>
+      <w:proofErr w:type="spellEnd"/>
+      <w:r>
+        <w:rPr>
+          <w:rFonts w:ascii="Times New Roman" w:hAnsi="Times New Roman" w:cs="Times New Roman"/>
+          <w:sz w:val="28"/>
+          <w:szCs w:val="28"/>
+        </w:rPr>
+        <w:t>++) {</w:t>
+      </w:r>
+    </w:p>
+    <w:p>
+      <w:pPr>
+        <w:rPr>
+          <w:rFonts w:ascii="Times New Roman" w:hAnsi="Times New Roman" w:cs="Times New Roman"/>
+          <w:sz w:val="28"/>
+          <w:szCs w:val="28"/>
+        </w:rPr>
+      </w:pPr>
+      <w:r>
+        <w:rPr>
+          <w:rFonts w:ascii="Times New Roman" w:hAnsi="Times New Roman" w:cs="Times New Roman"/>
+          <w:sz w:val="28"/>
+          <w:szCs w:val="28"/>
+        </w:rPr>
+        <w:t xml:space="preserve">            for (int j = </w:t>
+      </w:r>
+      <w:proofErr w:type="spellStart"/>
+      <w:r>
+        <w:rPr>
+          <w:rFonts w:ascii="Times New Roman" w:hAnsi="Times New Roman" w:cs="Times New Roman"/>
+          <w:sz w:val="28"/>
+          <w:szCs w:val="28"/>
+        </w:rPr>
+        <w:t>i</w:t>
+      </w:r>
+      <w:proofErr w:type="spellEnd"/>
+      <w:r>
+        <w:rPr>
+          <w:rFonts w:ascii="Times New Roman" w:hAnsi="Times New Roman" w:cs="Times New Roman"/>
+          <w:sz w:val="28"/>
+          <w:szCs w:val="28"/>
+        </w:rPr>
+        <w:t xml:space="preserve"> + 1; j &lt; n; </w:t>
+      </w:r>
+      <w:proofErr w:type="spellStart"/>
+      <w:r>
+        <w:rPr>
+          <w:rFonts w:ascii="Times New Roman" w:hAnsi="Times New Roman" w:cs="Times New Roman"/>
+          <w:sz w:val="28"/>
+          <w:szCs w:val="28"/>
+        </w:rPr>
+        <w:t>j++</w:t>
+      </w:r>
+      <w:proofErr w:type="spellEnd"/>
+      <w:r>
+        <w:rPr>
+          <w:rFonts w:ascii="Times New Roman" w:hAnsi="Times New Roman" w:cs="Times New Roman"/>
+          <w:sz w:val="28"/>
+          <w:szCs w:val="28"/>
+        </w:rPr>
+        <w:t>) {</w:t>
+      </w:r>
+    </w:p>
+    <w:p>
+      <w:pPr>
+        <w:rPr>
+          <w:rFonts w:ascii="Times New Roman" w:hAnsi="Times New Roman" w:cs="Times New Roman"/>
+          <w:sz w:val="28"/>
+          <w:szCs w:val="28"/>
+        </w:rPr>
+      </w:pPr>
+      <w:r>
+        <w:rPr>
+          <w:rFonts w:ascii="Times New Roman" w:hAnsi="Times New Roman" w:cs="Times New Roman"/>
+          <w:sz w:val="28"/>
+          <w:szCs w:val="28"/>
+        </w:rPr>
+        <w:t xml:space="preserve">                </w:t>
+      </w:r>
+      <w:proofErr w:type="spellStart"/>
+      <w:r>
+        <w:rPr>
+          <w:rFonts w:ascii="Times New Roman" w:hAnsi="Times New Roman" w:cs="Times New Roman"/>
+          <w:sz w:val="28"/>
+          <w:szCs w:val="28"/>
+        </w:rPr>
+        <w:t>System.out.println</w:t>
+      </w:r>
+      <w:proofErr w:type="spellEnd"/>
+      <w:r>
+        <w:rPr>
+          <w:rFonts w:ascii="Times New Roman" w:hAnsi="Times New Roman" w:cs="Times New Roman"/>
+          <w:sz w:val="28"/>
+          <w:szCs w:val="28"/>
+        </w:rPr>
+        <w:t xml:space="preserve">("(" + </w:t>
+      </w:r>
+      <w:proofErr w:type="spellStart"/>
+      <w:r>
+        <w:rPr>
+          <w:rFonts w:ascii="Times New Roman" w:hAnsi="Times New Roman" w:cs="Times New Roman"/>
+          <w:sz w:val="28"/>
+          <w:szCs w:val="28"/>
+        </w:rPr>
+        <w:t>arr</w:t>
+      </w:r>
+      <w:proofErr w:type="spellEnd"/>
+      <w:r>
+        <w:rPr>
+          <w:rFonts w:ascii="Times New Roman" w:hAnsi="Times New Roman" w:cs="Times New Roman"/>
+          <w:sz w:val="28"/>
+          <w:szCs w:val="28"/>
+        </w:rPr>
+        <w:t>[</w:t>
+      </w:r>
+      <w:proofErr w:type="spellStart"/>
+      <w:r>
+        <w:rPr>
+          <w:rFonts w:ascii="Times New Roman" w:hAnsi="Times New Roman" w:cs="Times New Roman"/>
+          <w:sz w:val="28"/>
+          <w:szCs w:val="28"/>
+        </w:rPr>
+        <w:t>i</w:t>
+      </w:r>
+      <w:proofErr w:type="spellEnd"/>
+      <w:r>
+        <w:rPr>
+          <w:rFonts w:ascii="Times New Roman" w:hAnsi="Times New Roman" w:cs="Times New Roman"/>
+          <w:sz w:val="28"/>
+          <w:szCs w:val="28"/>
+        </w:rPr>
+        <w:t xml:space="preserve">] + ", " + </w:t>
+      </w:r>
+      <w:proofErr w:type="spellStart"/>
+      <w:r>
+        <w:rPr>
+          <w:rFonts w:ascii="Times New Roman" w:hAnsi="Times New Roman" w:cs="Times New Roman"/>
+          <w:sz w:val="28"/>
+          <w:szCs w:val="28"/>
+        </w:rPr>
+        <w:t>arr</w:t>
+      </w:r>
+      <w:proofErr w:type="spellEnd"/>
+      <w:r>
+        <w:rPr>
+          <w:rFonts w:ascii="Times New Roman" w:hAnsi="Times New Roman" w:cs="Times New Roman"/>
+          <w:sz w:val="28"/>
+          <w:szCs w:val="28"/>
+        </w:rPr>
+        <w:t>[j] + ")");</w:t>
+      </w:r>
+    </w:p>
+    <w:p>
+      <w:pPr>
+        <w:rPr>
+          <w:rFonts w:ascii="Times New Roman" w:hAnsi="Times New Roman" w:cs="Times New Roman"/>
+          <w:sz w:val="28"/>
+          <w:szCs w:val="28"/>
+        </w:rPr>
+      </w:pPr>
+      <w:r>
+        <w:rPr>
+          <w:rFonts w:ascii="Times New Roman" w:hAnsi="Times New Roman" w:cs="Times New Roman"/>
+          <w:sz w:val="28"/>
+          <w:szCs w:val="28"/>
+        </w:rPr>
+        <w:t xml:space="preserve">            }</w:t>
+      </w:r>
+    </w:p>
+    <w:p>
+      <w:pPr>
+        <w:rPr>
+          <w:rFonts w:ascii="Times New Roman" w:hAnsi="Times New Roman" w:cs="Times New Roman"/>
+          <w:sz w:val="28"/>
+          <w:szCs w:val="28"/>
+        </w:rPr>
+      </w:pPr>
+      <w:r>
+        <w:rPr>
+          <w:rFonts w:ascii="Times New Roman" w:hAnsi="Times New Roman" w:cs="Times New Roman"/>
+          <w:sz w:val="28"/>
+          <w:szCs w:val="28"/>
+        </w:rPr>
+        <w:t xml:space="preserve">        }</w:t>
+      </w:r>
+    </w:p>
+    <w:p>
+      <w:pPr>
+        <w:rPr>
+          <w:rFonts w:ascii="Times New Roman" w:hAnsi="Times New Roman" w:cs="Times New Roman"/>
+          <w:sz w:val="28"/>
+          <w:szCs w:val="28"/>
+        </w:rPr>
+      </w:pPr>
+    </w:p>
+    <w:p>
+      <w:pPr>
+        <w:rPr>
+          <w:rFonts w:ascii="Times New Roman" w:hAnsi="Times New Roman" w:cs="Times New Roman"/>
+          <w:sz w:val="28"/>
+          <w:szCs w:val="28"/>
+        </w:rPr>
+      </w:pPr>
+      <w:r>
+        <w:rPr>
+          <w:rFonts w:ascii="Times New Roman" w:hAnsi="Times New Roman" w:cs="Times New Roman"/>
+          <w:sz w:val="28"/>
+          <w:szCs w:val="28"/>
+        </w:rPr>
+        <w:t xml:space="preserve">        </w:t>
+      </w:r>
+      <w:proofErr w:type="spellStart"/>
+      <w:proofErr w:type="gramStart"/>
+      <w:r>
+        <w:rPr>
+          <w:rFonts w:ascii="Times New Roman" w:hAnsi="Times New Roman" w:cs="Times New Roman"/>
+          <w:sz w:val="28"/>
+          <w:szCs w:val="28"/>
+        </w:rPr>
+        <w:t>sc.close</w:t>
+      </w:r>
+      <w:proofErr w:type="spellEnd"/>
+      <w:proofErr w:type="gramEnd"/>
+      <w:r>
+        <w:rPr>
+          <w:rFonts w:ascii="Times New Roman" w:hAnsi="Times New Roman" w:cs="Times New Roman"/>
+          <w:sz w:val="28"/>
+          <w:szCs w:val="28"/>
+        </w:rPr>
+        <w:t>();</w:t>
+      </w:r>
+    </w:p>
+    <w:p>
+      <w:pPr>
+        <w:rPr>
+          <w:rFonts w:ascii="Times New Roman" w:hAnsi="Times New Roman" w:cs="Times New Roman"/>
+          <w:sz w:val="28"/>
+          <w:szCs w:val="28"/>
+        </w:rPr>
+      </w:pPr>
+      <w:r>
+        <w:rPr>
+          <w:rFonts w:ascii="Times New Roman" w:hAnsi="Times New Roman" w:cs="Times New Roman"/>
+          <w:sz w:val="28"/>
+          <w:szCs w:val="28"/>
+        </w:rPr>
+        <w:t xml:space="preserve">    }</w:t>
+      </w:r>
+    </w:p>
+    <w:p>
+      <w:pPr>
+        <w:rPr>
+          <w:rFonts w:ascii="Times New Roman" w:hAnsi="Times New Roman" w:cs="Times New Roman"/>
+          <w:sz w:val="28"/>
+          <w:szCs w:val="28"/>
+        </w:rPr>
+      </w:pPr>
+      <w:r>
+        <w:rPr>
+          <w:rFonts w:ascii="Times New Roman" w:hAnsi="Times New Roman" w:cs="Times New Roman"/>
+          <w:sz w:val="28"/>
+          <w:szCs w:val="28"/>
+        </w:rPr>
+        <w:t>}</w:t>
+      </w:r>
+    </w:p>
+    <w:p>
+      <w:pPr>
+        <w:rPr>
+          <w:rFonts w:ascii="Times New Roman" w:hAnsi="Times New Roman" w:cs="Times New Roman"/>
+          <w:sz w:val="28"/>
+          <w:szCs w:val="28"/>
+        </w:rPr>
+      </w:pPr>
+    </w:p>
+    <w:p>
+      <w:pPr>
+        <w:rPr>
+          <w:rFonts w:ascii="Times New Roman" w:hAnsi="Times New Roman" w:cs="Times New Roman"/>
+          <w:b/>
+          <w:bCs/>
+          <w:sz w:val="28"/>
+          <w:szCs w:val="28"/>
+        </w:rPr>
+      </w:pPr>
+      <w:r>
+        <w:rPr>
+          <w:rFonts w:ascii="Times New Roman" w:hAnsi="Times New Roman" w:cs="Times New Roman"/>
+          <w:b/>
+          <w:bCs/>
+          <w:sz w:val="28"/>
+          <w:szCs w:val="28"/>
+        </w:rPr>
+        <w:t>Sample Output</w:t>
+      </w:r>
+      <w:r>
+        <w:rPr>
+          <w:rFonts w:ascii="Times New Roman" w:hAnsi="Times New Roman" w:cs="Times New Roman"/>
+          <w:b/>
+          <w:bCs/>
+          <w:sz w:val="28"/>
+          <w:szCs w:val="28"/>
+        </w:rPr>
+        <w:t>:</w:t>
+      </w:r>
+    </w:p>
+    <w:p>
+      <w:pPr>
+        <w:rPr>
+          <w:rFonts w:ascii="Times New Roman" w:hAnsi="Times New Roman" w:cs="Times New Roman"/>
+          <w:b/>
+          <w:bCs/>
+          <w:sz w:val="28"/>
+          <w:szCs w:val="28"/>
+        </w:rPr>
+      </w:pPr>
+      <w:r>
+        <w:rPr>
+          <w:rFonts w:ascii="Times New Roman" w:hAnsi="Times New Roman" w:cs="Times New Roman"/>
+          <w:b/>
+          <w:bCs/>
+          <w:noProof/>
+          <w:sz w:val="28"/>
+          <w:szCs w:val="28"/>
+        </w:rPr>
+        <w:drawing>
+          <wp:inline distT="0" distB="0" distL="0" distR="0" wp14:anchorId="20D78D51" wp14:editId="17015DE1">
+            <wp:extent cx="5731510" cy="2487930"/>
+            <wp:effectExtent l="0" t="0" r="2540" b="7620"/>
+            <wp:docPr id="121918755" name="Picture 1"/>
+            <wp:cNvGraphicFramePr>
+              <a:graphicFrameLocks xmlns:a="http://schemas.openxmlformats.org/drawingml/2006/main" noChangeAspect="1"/>
+            </wp:cNvGraphicFramePr>
+            <a:graphic xmlns:a="http://schemas.openxmlformats.org/drawingml/2006/main">
+              <a:graphicData uri="http://schemas.openxmlformats.org/drawingml/2006/picture">
+                <pic:pic xmlns:pic="http://schemas.openxmlformats.org/drawingml/2006/picture">
+                  <pic:nvPicPr>
+                    <pic:cNvPr id="121918755" name="Picture 121918755"/>
+                    <pic:cNvPicPr/>
+                  </pic:nvPicPr>
+                  <pic:blipFill>
+                    <a:blip r:embed="rId12">
+                      <a:extLst>
+                        <a:ext uri="{28A0092B-C50C-407E-A947-70E740481C1C}">
+                          <a14:useLocalDpi xmlns:a14="http://schemas.microsoft.com/office/drawing/2010/main" val="0"/>
+                        </a:ext>
+                      </a:extLst>
+                    </a:blip>
+                    <a:stretch>
+                      <a:fillRect/>
+                    </a:stretch>
+                  </pic:blipFill>
+                  <pic:spPr>
+                    <a:xfrm>
+                      <a:off x="0" y="0"/>
+                      <a:ext cx="5731510" cy="2487930"/>
+                    </a:xfrm>
+                    <a:prstGeom prst="rect">
+                      <a:avLst/>
+                    </a:prstGeom>
+                  </pic:spPr>
+                </pic:pic>
+              </a:graphicData>
+            </a:graphic>
+          </wp:inline>
+        </w:drawing>
+      </w:r>
+    </w:p>
+    <w:p>
+      <w:pPr>
+        <w:rPr>
+          <w:rFonts w:ascii="Times New Roman" w:hAnsi="Times New Roman" w:cs="Times New Roman"/>
+          <w:sz w:val="28"/>
+          <w:szCs w:val="28"/>
+        </w:rPr>
+      </w:pPr>
+      <w:r>
+        <w:rPr>
+          <w:rFonts w:ascii="Times New Roman" w:hAnsi="Times New Roman" w:cs="Times New Roman"/>
+          <w:sz w:val="28"/>
+          <w:szCs w:val="28"/>
+        </w:rPr>
+        <w:lastRenderedPageBreak/>
+        <w:t>Enter the number of elements: 4</w:t>
+      </w:r>
+    </w:p>
+    <w:p>
+      <w:pPr>
+        <w:rPr>
+          <w:rFonts w:ascii="Times New Roman" w:hAnsi="Times New Roman" w:cs="Times New Roman"/>
+          <w:sz w:val="28"/>
+          <w:szCs w:val="28"/>
+        </w:rPr>
+      </w:pPr>
+      <w:r>
+        <w:rPr>
+          <w:rFonts w:ascii="Times New Roman" w:hAnsi="Times New Roman" w:cs="Times New Roman"/>
+          <w:sz w:val="28"/>
+          <w:szCs w:val="28"/>
+        </w:rPr>
+        <w:t>Enter the array elements:</w:t>
+      </w:r>
+    </w:p>
+    <w:p>
+      <w:pPr>
+        <w:rPr>
+          <w:rFonts w:ascii="Times New Roman" w:hAnsi="Times New Roman" w:cs="Times New Roman"/>
+          <w:sz w:val="28"/>
+          <w:szCs w:val="28"/>
+        </w:rPr>
+      </w:pPr>
+      <w:r>
+        <w:rPr>
+          <w:rFonts w:ascii="Times New Roman" w:hAnsi="Times New Roman" w:cs="Times New Roman"/>
+          <w:sz w:val="28"/>
+          <w:szCs w:val="28"/>
+        </w:rPr>
+        <w:t>10</w:t>
+      </w:r>
+    </w:p>
+    <w:p>
+      <w:pPr>
+        <w:rPr>
+          <w:rFonts w:ascii="Times New Roman" w:hAnsi="Times New Roman" w:cs="Times New Roman"/>
+          <w:sz w:val="28"/>
+          <w:szCs w:val="28"/>
+        </w:rPr>
+      </w:pPr>
+      <w:r>
+        <w:rPr>
+          <w:rFonts w:ascii="Times New Roman" w:hAnsi="Times New Roman" w:cs="Times New Roman"/>
+          <w:sz w:val="28"/>
+          <w:szCs w:val="28"/>
+        </w:rPr>
+        <w:t>20</w:t>
+      </w:r>
+    </w:p>
+    <w:p>
+      <w:pPr>
+        <w:rPr>
+          <w:rFonts w:ascii="Times New Roman" w:hAnsi="Times New Roman" w:cs="Times New Roman"/>
+          <w:sz w:val="28"/>
+          <w:szCs w:val="28"/>
+        </w:rPr>
+      </w:pPr>
+      <w:r>
+        <w:rPr>
+          <w:rFonts w:ascii="Times New Roman" w:hAnsi="Times New Roman" w:cs="Times New Roman"/>
+          <w:sz w:val="28"/>
+          <w:szCs w:val="28"/>
+        </w:rPr>
+        <w:t>30</w:t>
+      </w:r>
+    </w:p>
+    <w:p>
+      <w:pPr>
+        <w:rPr>
+          <w:rFonts w:ascii="Times New Roman" w:hAnsi="Times New Roman" w:cs="Times New Roman"/>
+          <w:sz w:val="28"/>
+          <w:szCs w:val="28"/>
+        </w:rPr>
+      </w:pPr>
+      <w:r>
+        <w:rPr>
+          <w:rFonts w:ascii="Times New Roman" w:hAnsi="Times New Roman" w:cs="Times New Roman"/>
+          <w:sz w:val="28"/>
+          <w:szCs w:val="28"/>
+        </w:rPr>
+        <w:t>40</w:t>
+      </w:r>
+    </w:p>
+    <w:p>
+      <w:pPr>
+        <w:rPr>
+          <w:rFonts w:ascii="Times New Roman" w:hAnsi="Times New Roman" w:cs="Times New Roman"/>
+          <w:sz w:val="28"/>
+          <w:szCs w:val="28"/>
+        </w:rPr>
+      </w:pPr>
+      <w:r>
+        <w:rPr>
+          <w:rFonts w:ascii="Times New Roman" w:hAnsi="Times New Roman" w:cs="Times New Roman"/>
+          <w:sz w:val="28"/>
+          <w:szCs w:val="28"/>
+        </w:rPr>
+        <w:t>All possible pairs are:</w:t>
+      </w:r>
+    </w:p>
+    <w:p>
+      <w:pPr>
+        <w:rPr>
+          <w:rFonts w:ascii="Times New Roman" w:hAnsi="Times New Roman" w:cs="Times New Roman"/>
+          <w:sz w:val="28"/>
+          <w:szCs w:val="28"/>
+        </w:rPr>
+      </w:pPr>
+      <w:r>
+        <w:rPr>
+          <w:rFonts w:ascii="Times New Roman" w:hAnsi="Times New Roman" w:cs="Times New Roman"/>
+          <w:sz w:val="28"/>
+          <w:szCs w:val="28"/>
+        </w:rPr>
+        <w:t>(10, 20)</w:t>
+      </w:r>
+    </w:p>
+    <w:p>
+      <w:pPr>
+        <w:rPr>
+          <w:rFonts w:ascii="Times New Roman" w:hAnsi="Times New Roman" w:cs="Times New Roman"/>
+          <w:sz w:val="28"/>
+          <w:szCs w:val="28"/>
+        </w:rPr>
+      </w:pPr>
+      <w:r>
+        <w:rPr>
+          <w:rFonts w:ascii="Times New Roman" w:hAnsi="Times New Roman" w:cs="Times New Roman"/>
+          <w:sz w:val="28"/>
+          <w:szCs w:val="28"/>
+        </w:rPr>
+        <w:t>(10, 30)</w:t>
+      </w:r>
+    </w:p>
+    <w:p>
+      <w:pPr>
+        <w:rPr>
+          <w:rFonts w:ascii="Times New Roman" w:hAnsi="Times New Roman" w:cs="Times New Roman"/>
+          <w:sz w:val="28"/>
+          <w:szCs w:val="28"/>
+        </w:rPr>
+      </w:pPr>
+      <w:r>
+        <w:rPr>
+          <w:rFonts w:ascii="Times New Roman" w:hAnsi="Times New Roman" w:cs="Times New Roman"/>
+          <w:sz w:val="28"/>
+          <w:szCs w:val="28"/>
+        </w:rPr>
+        <w:t>(10, 40)</w:t>
+      </w:r>
+    </w:p>
+    <w:p>
+      <w:pPr>
+        <w:rPr>
+          <w:rFonts w:ascii="Times New Roman" w:hAnsi="Times New Roman" w:cs="Times New Roman"/>
+          <w:sz w:val="28"/>
+          <w:szCs w:val="28"/>
+        </w:rPr>
+      </w:pPr>
+      <w:r>
+        <w:rPr>
+          <w:rFonts w:ascii="Times New Roman" w:hAnsi="Times New Roman" w:cs="Times New Roman"/>
+          <w:sz w:val="28"/>
+          <w:szCs w:val="28"/>
+        </w:rPr>
+        <w:t>(20, 30)</w:t>
+      </w:r>
+    </w:p>
+    <w:p>
+      <w:pPr>
+        <w:rPr>
+          <w:rFonts w:ascii="Times New Roman" w:hAnsi="Times New Roman" w:cs="Times New Roman"/>
+          <w:sz w:val="28"/>
+          <w:szCs w:val="28"/>
+        </w:rPr>
+      </w:pPr>
+      <w:r>
+        <w:rPr>
+          <w:rFonts w:ascii="Times New Roman" w:hAnsi="Times New Roman" w:cs="Times New Roman"/>
+          <w:sz w:val="28"/>
+          <w:szCs w:val="28"/>
+        </w:rPr>
+        <w:t>(20, 40)</w:t>
+      </w:r>
+    </w:p>
+    <w:p>
+      <w:pPr>
+        <w:rPr>
+          <w:rFonts w:ascii="Times New Roman" w:hAnsi="Times New Roman" w:cs="Times New Roman"/>
+          <w:sz w:val="28"/>
+          <w:szCs w:val="28"/>
+        </w:rPr>
+      </w:pPr>
+      <w:r>
+        <w:rPr>
+          <w:rFonts w:ascii="Times New Roman" w:hAnsi="Times New Roman" w:cs="Times New Roman"/>
+          <w:sz w:val="28"/>
+          <w:szCs w:val="28"/>
+        </w:rPr>
+        <w:t>(30, 40)</w:t>
+      </w:r>
+    </w:p>
+    <w:p>
+      <w:pPr>
+        <w:rPr>
+          <w:rFonts w:ascii="Times New Roman" w:hAnsi="Times New Roman" w:cs="Times New Roman"/>
+          <w:sz w:val="28"/>
+          <w:szCs w:val="28"/>
+        </w:rPr>
+      </w:pPr>
+    </w:p>
+    <w:p>
+      <w:pPr>
+        <w:rPr>
+          <w:rFonts w:ascii="Times New Roman" w:hAnsi="Times New Roman" w:cs="Times New Roman"/>
+          <w:b/>
+          <w:bCs/>
+          <w:sz w:val="28"/>
+          <w:szCs w:val="28"/>
+        </w:rPr>
+      </w:pPr>
+      <w:r>
+        <w:rPr>
+          <w:rFonts w:ascii="Times New Roman" w:hAnsi="Times New Roman" w:cs="Times New Roman"/>
+          <w:b/>
+          <w:bCs/>
+          <w:sz w:val="28"/>
+          <w:szCs w:val="28"/>
+        </w:rPr>
+        <w:t>Result</w:t>
+      </w:r>
+      <w:r>
+        <w:rPr>
+          <w:rFonts w:ascii="Times New Roman" w:hAnsi="Times New Roman" w:cs="Times New Roman"/>
+          <w:b/>
+          <w:bCs/>
+          <w:sz w:val="28"/>
+          <w:szCs w:val="28"/>
+        </w:rPr>
+        <w:t>:</w:t>
+      </w:r>
+    </w:p>
+    <w:p>
+      <w:pPr>
+        <w:rPr>
+          <w:rFonts w:ascii="Times New Roman" w:hAnsi="Times New Roman" w:cs="Times New Roman"/>
+          <w:sz w:val="28"/>
+          <w:szCs w:val="28"/>
+        </w:rPr>
+      </w:pPr>
+      <w:r>
+        <w:rPr>
+          <w:rFonts w:ascii="Times New Roman" w:hAnsi="Times New Roman" w:cs="Times New Roman"/>
+          <w:sz w:val="28"/>
+          <w:szCs w:val="28"/>
+        </w:rPr>
+        <w:t>Thus, the Java program to print all possible pairs of elements from an array was executed successfully and the output was verified.</w:t>
+      </w:r>
+    </w:p>
+    <w:p/>
     <w:sectPr>
       <w:pgSz w:w="11906" w:h="16838"/>
       <w:pgMar w:top="1440" w:right="1440" w:bottom="1440" w:left="1440" w:header="708" w:footer="708" w:gutter="0"/>
@@ -4502,6 +6185,123 @@
     </w:lvl>
   </w:abstractNum>
   <w:abstractNum w:abstractNumId="2" w15:restartNumberingAfterBreak="0">
+    <w:nsid w:val="317D3FAE"/>
+    <w:multiLevelType w:val="multilevel"/>
+    <w:tmpl w:val="70EEDDF4"/>
+    <w:lvl w:ilvl="0">
+      <w:start w:val="1"/>
+      <w:numFmt w:val="decimal"/>
+      <w:lvlText w:val="%1."/>
+      <w:lvlJc w:val="left"/>
+      <w:pPr>
+        <w:tabs>
+          <w:tab w:val="num" w:pos="720"/>
+        </w:tabs>
+        <w:ind w:left="720" w:hanging="360"/>
+      </w:pPr>
+    </w:lvl>
+    <w:lvl w:ilvl="1">
+      <w:start w:val="1"/>
+      <w:numFmt w:val="bullet"/>
+      <w:lvlText w:val="o"/>
+      <w:lvlJc w:val="left"/>
+      <w:pPr>
+        <w:tabs>
+          <w:tab w:val="num" w:pos="1440"/>
+        </w:tabs>
+        <w:ind w:left="1440" w:hanging="360"/>
+      </w:pPr>
+      <w:rPr>
+        <w:rFonts w:ascii="Courier New" w:hAnsi="Courier New" w:hint="default"/>
+        <w:sz w:val="20"/>
+      </w:rPr>
+    </w:lvl>
+    <w:lvl w:ilvl="2" w:tentative="1">
+      <w:start w:val="1"/>
+      <w:numFmt w:val="decimal"/>
+      <w:lvlText w:val="%3."/>
+      <w:lvlJc w:val="left"/>
+      <w:pPr>
+        <w:tabs>
+          <w:tab w:val="num" w:pos="2160"/>
+        </w:tabs>
+        <w:ind w:left="2160" w:hanging="360"/>
+      </w:pPr>
+    </w:lvl>
+    <w:lvl w:ilvl="3" w:tentative="1">
+      <w:start w:val="1"/>
+      <w:numFmt w:val="decimal"/>
+      <w:lvlText w:val="%4."/>
+      <w:lvlJc w:val="left"/>
+      <w:pPr>
+        <w:tabs>
+          <w:tab w:val="num" w:pos="2880"/>
+        </w:tabs>
+        <w:ind w:left="2880" w:hanging="360"/>
+      </w:pPr>
+    </w:lvl>
+    <w:lvl w:ilvl="4" w:tentative="1">
+      <w:start w:val="1"/>
+      <w:numFmt w:val="decimal"/>
+      <w:lvlText w:val="%5."/>
+      <w:lvlJc w:val="left"/>
+      <w:pPr>
+        <w:tabs>
+          <w:tab w:val="num" w:pos="3600"/>
+        </w:tabs>
+        <w:ind w:left="3600" w:hanging="360"/>
+      </w:pPr>
+    </w:lvl>
+    <w:lvl w:ilvl="5" w:tentative="1">
+      <w:start w:val="1"/>
+      <w:numFmt w:val="decimal"/>
+      <w:lvlText w:val="%6."/>
+      <w:lvlJc w:val="left"/>
+      <w:pPr>
+        <w:tabs>
+          <w:tab w:val="num" w:pos="4320"/>
+        </w:tabs>
+        <w:ind w:left="4320" w:hanging="360"/>
+      </w:pPr>
+    </w:lvl>
+    <w:lvl w:ilvl="6" w:tentative="1">
+      <w:start w:val="1"/>
+      <w:numFmt w:val="decimal"/>
+      <w:lvlText w:val="%7."/>
+      <w:lvlJc w:val="left"/>
+      <w:pPr>
+        <w:tabs>
+          <w:tab w:val="num" w:pos="5040"/>
+        </w:tabs>
+        <w:ind w:left="5040" w:hanging="360"/>
+      </w:pPr>
+    </w:lvl>
+    <w:lvl w:ilvl="7" w:tentative="1">
+      <w:start w:val="1"/>
+      <w:numFmt w:val="decimal"/>
+      <w:lvlText w:val="%8."/>
+      <w:lvlJc w:val="left"/>
+      <w:pPr>
+        <w:tabs>
+          <w:tab w:val="num" w:pos="5760"/>
+        </w:tabs>
+        <w:ind w:left="5760" w:hanging="360"/>
+      </w:pPr>
+    </w:lvl>
+    <w:lvl w:ilvl="8" w:tentative="1">
+      <w:start w:val="1"/>
+      <w:numFmt w:val="decimal"/>
+      <w:lvlText w:val="%9."/>
+      <w:lvlJc w:val="left"/>
+      <w:pPr>
+        <w:tabs>
+          <w:tab w:val="num" w:pos="6480"/>
+        </w:tabs>
+        <w:ind w:left="6480" w:hanging="360"/>
+      </w:pPr>
+    </w:lvl>
+  </w:abstractNum>
+  <w:abstractNum w:abstractNumId="3" w15:restartNumberingAfterBreak="0">
     <w:nsid w:val="32E9429E"/>
     <w:multiLevelType w:val="multilevel"/>
     <w:tmpl w:val="E4DC6A30"/>
@@ -4614,7 +6414,7 @@
       </w:pPr>
     </w:lvl>
   </w:abstractNum>
-  <w:abstractNum w:abstractNumId="3" w15:restartNumberingAfterBreak="0">
+  <w:abstractNum w:abstractNumId="4" w15:restartNumberingAfterBreak="0">
     <w:nsid w:val="3F0A20D9"/>
     <w:multiLevelType w:val="multilevel"/>
     <w:tmpl w:val="D52484EA"/>
@@ -4727,7 +6527,7 @@
       </w:pPr>
     </w:lvl>
   </w:abstractNum>
-  <w:abstractNum w:abstractNumId="4" w15:restartNumberingAfterBreak="0">
+  <w:abstractNum w:abstractNumId="5" w15:restartNumberingAfterBreak="0">
     <w:nsid w:val="4B8147CF"/>
     <w:multiLevelType w:val="multilevel"/>
     <w:tmpl w:val="357435F6"/>
@@ -4840,7 +6640,7 @@
       </w:pPr>
     </w:lvl>
   </w:abstractNum>
-  <w:abstractNum w:abstractNumId="5" w15:restartNumberingAfterBreak="0">
+  <w:abstractNum w:abstractNumId="6" w15:restartNumberingAfterBreak="0">
     <w:nsid w:val="676A105A"/>
     <w:multiLevelType w:val="multilevel"/>
     <w:tmpl w:val="F31899F8"/>
@@ -4954,13 +6754,13 @@
     </w:lvl>
   </w:abstractNum>
   <w:num w:numId="1" w16cid:durableId="1129781777">
+    <w:abstractNumId w:val="4"/>
+  </w:num>
+  <w:num w:numId="2" w16cid:durableId="210071026">
     <w:abstractNumId w:val="3"/>
   </w:num>
-  <w:num w:numId="2" w16cid:durableId="210071026">
-    <w:abstractNumId w:val="2"/>
-  </w:num>
   <w:num w:numId="3" w16cid:durableId="571818255">
-    <w:abstractNumId w:val="5"/>
+    <w:abstractNumId w:val="6"/>
   </w:num>
   <w:num w:numId="4" w16cid:durableId="25765275">
     <w:abstractNumId w:val="0"/>
@@ -4969,7 +6769,10 @@
     <w:abstractNumId w:val="1"/>
   </w:num>
   <w:num w:numId="6" w16cid:durableId="1290938511">
-    <w:abstractNumId w:val="4"/>
+    <w:abstractNumId w:val="5"/>
+  </w:num>
+  <w:num w:numId="7" w16cid:durableId="877166362">
+    <w:abstractNumId w:val="2"/>
   </w:num>
 </w:numbering>
 </file>
@@ -5578,6 +7381,7 @@
   <w:style w:type="character" w:default="1" w:styleId="DefaultParagraphFont">
     <w:name w:val="Default Paragraph Font"/>
     <w:uiPriority w:val="1"/>
+    <w:semiHidden/>
     <w:unhideWhenUsed/>
   </w:style>
   <w:style w:type="table" w:default="1" w:styleId="TableNormal">

</xml_diff>